<commit_message>
Pruebas Unitarias y de Caja blanca hechas
</commit_message>
<xml_diff>
--- a/Proyecto/docs/ADS_ProyectoFinal_DocumentacionCompleta.docx
+++ b/Proyecto/docs/ADS_ProyectoFinal_DocumentacionCompleta.docx
@@ -88,25 +88,7 @@
           <w:sz w:val="52"/>
           <w:szCs w:val="52"/>
         </w:rPr>
-        <w:t xml:space="preserve">Sistema POS (Point </w:t>
-      </w:r>
-      <w:proofErr w:type="spellStart"/>
-      <w:r>
-        <w:rPr>
-          <w:rFonts w:ascii="Proxima Nova" w:eastAsia="Proxima Nova" w:hAnsi="Proxima Nova" w:cs="Proxima Nova"/>
-          <w:sz w:val="52"/>
-          <w:szCs w:val="52"/>
-        </w:rPr>
-        <w:t>of</w:t>
-      </w:r>
-      <w:proofErr w:type="spellEnd"/>
-      <w:r>
-        <w:rPr>
-          <w:rFonts w:ascii="Proxima Nova" w:eastAsia="Proxima Nova" w:hAnsi="Proxima Nova" w:cs="Proxima Nova"/>
-          <w:sz w:val="52"/>
-          <w:szCs w:val="52"/>
-        </w:rPr>
-        <w:t xml:space="preserve"> Sale)</w:t>
+        <w:t>Sistema POS (Point of Sale)</w:t>
       </w:r>
     </w:p>
     <w:p>
@@ -4882,21 +4864,7 @@
         <w:rPr>
           <w:lang w:val="es-ES"/>
         </w:rPr>
-        <w:t xml:space="preserve">Generación de </w:t>
-      </w:r>
-      <w:proofErr w:type="gramStart"/>
-      <w:r>
-        <w:rPr>
-          <w:lang w:val="es-ES"/>
-        </w:rPr>
-        <w:t>tickets</w:t>
-      </w:r>
-      <w:proofErr w:type="gramEnd"/>
-      <w:r>
-        <w:rPr>
-          <w:lang w:val="es-ES"/>
-        </w:rPr>
-        <w:t xml:space="preserve"> o comprobantes</w:t>
+        <w:t>Generación de tickets o comprobantes</w:t>
       </w:r>
     </w:p>
     <w:p>
@@ -5071,14 +5039,12 @@
         </w:rPr>
         <w:t xml:space="preserve">IDE: </w:t>
       </w:r>
-      <w:proofErr w:type="spellStart"/>
       <w:r>
         <w:rPr>
           <w:lang w:val="es-ES"/>
         </w:rPr>
         <w:t>VSCode</w:t>
       </w:r>
-      <w:proofErr w:type="spellEnd"/>
     </w:p>
     <w:p>
       <w:pPr>
@@ -5164,7 +5130,6 @@
           <w:lang w:val="es-ES"/>
         </w:rPr>
       </w:pPr>
-      <w:proofErr w:type="spellStart"/>
       <w:r>
         <w:rPr>
           <w:lang w:val="es-ES"/>
@@ -5177,7 +5142,6 @@
         </w:rPr>
         <w:t>ón</w:t>
       </w:r>
-      <w:proofErr w:type="spellEnd"/>
       <w:r>
         <w:rPr>
           <w:lang w:val="es-ES"/>
@@ -5268,7 +5232,6 @@
           <w:lang w:val="es-ES"/>
         </w:rPr>
       </w:pPr>
-      <w:proofErr w:type="spellStart"/>
       <w:r>
         <w:rPr>
           <w:lang w:val="es-ES"/>
@@ -5279,14 +5242,7 @@
         <w:rPr>
           <w:lang w:val="es-MX"/>
         </w:rPr>
-        <w:t>ón</w:t>
-      </w:r>
-      <w:proofErr w:type="spellEnd"/>
-      <w:r>
-        <w:rPr>
-          <w:lang w:val="es-MX"/>
-        </w:rPr>
-        <w:t xml:space="preserve"> </w:t>
+        <w:t xml:space="preserve">ón </w:t>
       </w:r>
       <w:r>
         <w:rPr>
@@ -5743,18 +5699,8 @@
           <w:rFonts w:ascii="Proxima Nova" w:hAnsi="Proxima Nova" w:cs="Arial"/>
           <w:lang w:val="es-MX"/>
         </w:rPr>
-        <w:t xml:space="preserve">Generación de </w:t>
-      </w:r>
-      <w:proofErr w:type="gramStart"/>
-      <w:r>
-        <w:rPr>
-          <w:rStyle w:val="Fuerte"/>
-          <w:rFonts w:ascii="Proxima Nova" w:hAnsi="Proxima Nova" w:cs="Arial"/>
-          <w:lang w:val="es-MX"/>
-        </w:rPr>
-        <w:t>tickets</w:t>
-      </w:r>
-      <w:proofErr w:type="gramEnd"/>
+        <w:t>Generación de tickets</w:t>
+      </w:r>
     </w:p>
     <w:p>
       <w:pPr>
@@ -6088,23 +6034,7 @@
           <w:rFonts w:ascii="Proxima Nova" w:hAnsi="Proxima Nova" w:cs="Arial"/>
           <w:lang w:val="es-MX"/>
         </w:rPr>
-        <w:t xml:space="preserve">Generar </w:t>
-      </w:r>
-      <w:proofErr w:type="gramStart"/>
-      <w:r>
-        <w:rPr>
-          <w:rFonts w:ascii="Proxima Nova" w:hAnsi="Proxima Nova" w:cs="Arial"/>
-          <w:lang w:val="es-MX"/>
-        </w:rPr>
-        <w:t>tickets</w:t>
-      </w:r>
-      <w:proofErr w:type="gramEnd"/>
-      <w:r>
-        <w:rPr>
-          <w:rFonts w:ascii="Proxima Nova" w:hAnsi="Proxima Nova" w:cs="Arial"/>
-          <w:lang w:val="es-MX"/>
-        </w:rPr>
-        <w:t xml:space="preserve"> de compra.</w:t>
+        <w:t>Generar tickets de compra.</w:t>
       </w:r>
     </w:p>
     <w:p>
@@ -6551,23 +6481,7 @@
           <w:rFonts w:ascii="Proxima Nova" w:hAnsi="Proxima Nova" w:cs="Arial"/>
           <w:lang w:val="es-MX"/>
         </w:rPr>
-        <w:t xml:space="preserve">Recibir </w:t>
-      </w:r>
-      <w:proofErr w:type="gramStart"/>
-      <w:r>
-        <w:rPr>
-          <w:rFonts w:ascii="Proxima Nova" w:hAnsi="Proxima Nova" w:cs="Arial"/>
-          <w:lang w:val="es-MX"/>
-        </w:rPr>
-        <w:t>ticket</w:t>
-      </w:r>
-      <w:proofErr w:type="gramEnd"/>
-      <w:r>
-        <w:rPr>
-          <w:rFonts w:ascii="Proxima Nova" w:hAnsi="Proxima Nova" w:cs="Arial"/>
-          <w:lang w:val="es-MX"/>
-        </w:rPr>
-        <w:t xml:space="preserve"> de compra.</w:t>
+        <w:t>Recibir ticket de compra.</w:t>
       </w:r>
     </w:p>
     <w:p>
@@ -6609,6 +6523,13 @@
         </w:rPr>
         <w:t>Añadir producto al carrito</w:t>
       </w:r>
+      <w:r>
+        <w:rPr>
+          <w:rFonts w:ascii="Proxima Nova" w:hAnsi="Proxima Nova" w:cs="Arial"/>
+          <w:lang w:val="es-MX"/>
+        </w:rPr>
+        <w:t>.</w:t>
+      </w:r>
     </w:p>
     <w:p>
       <w:pPr>
@@ -6928,18 +6849,10 @@
         <w:rPr>
           <w:lang w:val="es-MX"/>
         </w:rPr>
-        <w:t xml:space="preserve">Proceso de generación de </w:t>
-      </w:r>
-      <w:proofErr w:type="gramStart"/>
-      <w:r>
-        <w:rPr>
-          <w:lang w:val="es-MX"/>
-        </w:rPr>
-        <w:t>ticket</w:t>
+        <w:t>Proceso de generación de ticket</w:t>
       </w:r>
       <w:bookmarkEnd w:id="38"/>
       <w:bookmarkEnd w:id="39"/>
-      <w:proofErr w:type="gramEnd"/>
     </w:p>
     <w:p>
       <w:pPr>
@@ -6999,23 +6912,7 @@
           <w:rFonts w:ascii="Proxima Nova" w:hAnsi="Proxima Nova" w:cs="Arial"/>
           <w:lang w:val="es-MX"/>
         </w:rPr>
-        <w:t xml:space="preserve">Mostrar o imprimir </w:t>
-      </w:r>
-      <w:proofErr w:type="gramStart"/>
-      <w:r>
-        <w:rPr>
-          <w:rFonts w:ascii="Proxima Nova" w:hAnsi="Proxima Nova" w:cs="Arial"/>
-          <w:lang w:val="es-MX"/>
-        </w:rPr>
-        <w:t>ticket</w:t>
-      </w:r>
-      <w:proofErr w:type="gramEnd"/>
-      <w:r>
-        <w:rPr>
-          <w:rFonts w:ascii="Proxima Nova" w:hAnsi="Proxima Nova" w:cs="Arial"/>
-          <w:lang w:val="es-MX"/>
-        </w:rPr>
-        <w:t>.</w:t>
+        <w:t>Mostrar o imprimir ticket.</w:t>
       </w:r>
     </w:p>
     <w:p>
@@ -7250,23 +7147,7 @@
           <w:rFonts w:ascii="Proxima Nova" w:hAnsi="Proxima Nova" w:cs="Arial"/>
           <w:lang w:val="es-MX"/>
         </w:rPr>
-        <w:t xml:space="preserve">Generar </w:t>
-      </w:r>
-      <w:proofErr w:type="gramStart"/>
-      <w:r>
-        <w:rPr>
-          <w:rFonts w:ascii="Proxima Nova" w:hAnsi="Proxima Nova" w:cs="Arial"/>
-          <w:lang w:val="es-MX"/>
-        </w:rPr>
-        <w:t>tickets</w:t>
-      </w:r>
-      <w:proofErr w:type="gramEnd"/>
-      <w:r>
-        <w:rPr>
-          <w:rFonts w:ascii="Proxima Nova" w:hAnsi="Proxima Nova" w:cs="Arial"/>
-          <w:lang w:val="es-MX"/>
-        </w:rPr>
-        <w:t>.</w:t>
+        <w:t>Generar tickets.</w:t>
       </w:r>
     </w:p>
     <w:p>
@@ -7944,17 +7825,9 @@
         <w:rPr>
           <w:lang w:val="es-MX"/>
         </w:rPr>
-        <w:t xml:space="preserve">Inicio de </w:t>
-      </w:r>
-      <w:proofErr w:type="spellStart"/>
-      <w:r>
-        <w:rPr>
-          <w:lang w:val="es-MX"/>
-        </w:rPr>
-        <w:t>session</w:t>
+        <w:t>Inicio de session</w:t>
       </w:r>
       <w:bookmarkEnd w:id="57"/>
-      <w:proofErr w:type="spellEnd"/>
     </w:p>
     <w:p>
       <w:pPr>
@@ -8015,27 +7888,12 @@
         </w:rPr>
       </w:pPr>
       <w:bookmarkStart w:id="58" w:name="_Toc227703588"/>
-      <w:proofErr w:type="spellStart"/>
       <w:r>
         <w:rPr>
           <w:lang w:val="en-US"/>
         </w:rPr>
         <w:lastRenderedPageBreak/>
-        <w:t>Cerrar</w:t>
-      </w:r>
-      <w:proofErr w:type="spellEnd"/>
-      <w:r>
-        <w:rPr>
-          <w:lang w:val="en-US"/>
-        </w:rPr>
-        <w:t xml:space="preserve"> </w:t>
-      </w:r>
-      <w:proofErr w:type="spellStart"/>
-      <w:r>
-        <w:rPr>
-          <w:lang w:val="en-US"/>
-        </w:rPr>
-        <w:t>sesi</w:t>
+        <w:t>Cerrar sesi</w:t>
       </w:r>
       <w:r>
         <w:rPr>
@@ -8044,7 +7902,6 @@
         <w:t>ón</w:t>
       </w:r>
       <w:bookmarkEnd w:id="58"/>
-      <w:proofErr w:type="spellEnd"/>
     </w:p>
     <w:p>
       <w:pPr>
@@ -8515,17 +8372,9 @@
         <w:rPr>
           <w:lang w:val="es-MX"/>
         </w:rPr>
-        <w:t xml:space="preserve">Generar </w:t>
-      </w:r>
-      <w:proofErr w:type="gramStart"/>
-      <w:r>
-        <w:rPr>
-          <w:lang w:val="es-MX"/>
-        </w:rPr>
-        <w:t>tickets</w:t>
+        <w:t>Generar tickets</w:t>
       </w:r>
       <w:bookmarkEnd w:id="69"/>
-      <w:proofErr w:type="gramEnd"/>
     </w:p>
     <w:p>
       <w:pPr>
@@ -8601,21 +8450,7 @@
         <w:rPr>
           <w:lang w:val="es-MX"/>
         </w:rPr>
-        <w:t xml:space="preserve">Recibir </w:t>
-      </w:r>
-      <w:proofErr w:type="gramStart"/>
-      <w:r>
-        <w:rPr>
-          <w:lang w:val="es-MX"/>
-        </w:rPr>
-        <w:t>ticket</w:t>
-      </w:r>
-      <w:proofErr w:type="gramEnd"/>
-      <w:r>
-        <w:rPr>
-          <w:lang w:val="es-MX"/>
-        </w:rPr>
-        <w:t xml:space="preserve"> de compra</w:t>
+        <w:t>Recibir ticket de compra</w:t>
       </w:r>
       <w:bookmarkEnd w:id="73"/>
     </w:p>
@@ -8669,31 +8504,9 @@
         <w:rPr>
           <w:lang w:val="es-MX"/>
         </w:rPr>
-        <w:t xml:space="preserve">Poder añadir </w:t>
-      </w:r>
-      <w:proofErr w:type="spellStart"/>
-      <w:r>
-        <w:rPr>
-          <w:lang w:val="es-MX"/>
-        </w:rPr>
-        <w:t>tips</w:t>
-      </w:r>
-      <w:proofErr w:type="spellEnd"/>
-      <w:r>
-        <w:rPr>
-          <w:lang w:val="es-MX"/>
-        </w:rPr>
-        <w:t xml:space="preserve"> al </w:t>
-      </w:r>
-      <w:proofErr w:type="gramStart"/>
-      <w:r>
-        <w:rPr>
-          <w:lang w:val="es-MX"/>
-        </w:rPr>
-        <w:t>ticket</w:t>
+        <w:t>Poder añadir tips al ticket</w:t>
       </w:r>
       <w:bookmarkEnd w:id="76"/>
-      <w:proofErr w:type="gramEnd"/>
     </w:p>
     <w:p>
       <w:pPr>
@@ -8969,16 +8782,7 @@
           <w:rFonts w:ascii="Arial" w:hAnsi="Arial" w:cs="Arial"/>
           <w:lang w:val="es-MX"/>
         </w:rPr>
-        <w:t xml:space="preserve"> La integración con una base de datos, ya sea local (SQLite) o remota (MySQL</w:t>
-      </w:r>
-      <w:proofErr w:type="gramStart"/>
-      <w:r>
-        <w:rPr>
-          <w:rStyle w:val="citation-58"/>
-          <w:rFonts w:ascii="Arial" w:hAnsi="Arial" w:cs="Arial"/>
-          <w:lang w:val="es-MX"/>
-        </w:rPr>
-        <w:t xml:space="preserve">) </w:t>
+        <w:t xml:space="preserve"> La integración con una base de datos, ya sea local (SQLite) o remota (MySQL) </w:t>
       </w:r>
       <w:r>
         <w:rPr>
@@ -8986,16 +8790,7 @@
           <w:rFonts w:ascii="Arial" w:hAnsi="Arial" w:cs="Arial"/>
           <w:lang w:val="es-MX"/>
         </w:rPr>
-        <w:t>,</w:t>
-      </w:r>
-      <w:proofErr w:type="gramEnd"/>
-      <w:r>
-        <w:rPr>
-          <w:rStyle w:val="citation-57"/>
-          <w:rFonts w:ascii="Arial" w:hAnsi="Arial" w:cs="Arial"/>
-          <w:lang w:val="es-MX"/>
-        </w:rPr>
-        <w:t xml:space="preserve"> es directa y robusta dentro de esta arquitectura, permitiendo un manejo rápido para el registro de ventas y el control básico de inventario</w:t>
+        <w:t>, es directa y robusta dentro de esta arquitectura, permitiendo un manejo rápido para el registro de ventas y el control básico de inventario</w:t>
       </w:r>
     </w:p>
     <w:p>
@@ -9190,132 +8985,39 @@
           <w:sz w:val="24"/>
           <w:szCs w:val="24"/>
         </w:rPr>
-        <w:t> </w:t>
-      </w:r>
-      <w:proofErr w:type="spellStart"/>
-      <w:r>
+        <w:t> Usuario.Nombre, tipousuario.NombreTipo </w:t>
+      </w:r>
+    </w:p>
+    <w:p>
+      <w:pPr>
+        <w:ind w:left="720"/>
         <w:rPr>
           <w:sz w:val="24"/>
           <w:szCs w:val="24"/>
         </w:rPr>
-        <w:t>Usuario.Nombre</w:t>
-      </w:r>
-      <w:proofErr w:type="spellEnd"/>
+      </w:pPr>
       <w:r>
         <w:rPr>
           <w:sz w:val="24"/>
           <w:szCs w:val="24"/>
         </w:rPr>
-        <w:t>, </w:t>
-      </w:r>
-      <w:proofErr w:type="spellStart"/>
-      <w:proofErr w:type="gramStart"/>
-      <w:r>
+        <w:t>from Usuario INNER JOIN tipousuario </w:t>
+      </w:r>
+    </w:p>
+    <w:p>
+      <w:pPr>
+        <w:ind w:left="720"/>
         <w:rPr>
           <w:sz w:val="24"/>
           <w:szCs w:val="24"/>
         </w:rPr>
-        <w:t>tipousuario.NombreTipo</w:t>
-      </w:r>
-      <w:proofErr w:type="spellEnd"/>
-      <w:proofErr w:type="gramEnd"/>
+      </w:pPr>
       <w:r>
         <w:rPr>
           <w:sz w:val="24"/>
           <w:szCs w:val="24"/>
         </w:rPr>
-        <w:t> </w:t>
-      </w:r>
-    </w:p>
-    <w:p>
-      <w:pPr>
-        <w:ind w:left="720"/>
-        <w:rPr>
-          <w:sz w:val="24"/>
-          <w:szCs w:val="24"/>
-        </w:rPr>
-      </w:pPr>
-      <w:proofErr w:type="spellStart"/>
-      <w:r>
-        <w:rPr>
-          <w:sz w:val="24"/>
-          <w:szCs w:val="24"/>
-        </w:rPr>
-        <w:t>from</w:t>
-      </w:r>
-      <w:proofErr w:type="spellEnd"/>
-      <w:r>
-        <w:rPr>
-          <w:sz w:val="24"/>
-          <w:szCs w:val="24"/>
-        </w:rPr>
-        <w:t> Usuario INNER JOIN </w:t>
-      </w:r>
-      <w:proofErr w:type="spellStart"/>
-      <w:r>
-        <w:rPr>
-          <w:sz w:val="24"/>
-          <w:szCs w:val="24"/>
-        </w:rPr>
-        <w:t>tipousuario</w:t>
-      </w:r>
-      <w:proofErr w:type="spellEnd"/>
-      <w:r>
-        <w:rPr>
-          <w:sz w:val="24"/>
-          <w:szCs w:val="24"/>
-        </w:rPr>
-        <w:t> </w:t>
-      </w:r>
-    </w:p>
-    <w:p>
-      <w:pPr>
-        <w:ind w:left="720"/>
-        <w:rPr>
-          <w:sz w:val="24"/>
-          <w:szCs w:val="24"/>
-        </w:rPr>
-      </w:pPr>
-      <w:r>
-        <w:rPr>
-          <w:sz w:val="24"/>
-          <w:szCs w:val="24"/>
-        </w:rPr>
-        <w:t>ON </w:t>
-      </w:r>
-      <w:proofErr w:type="spellStart"/>
-      <w:r>
-        <w:rPr>
-          <w:sz w:val="24"/>
-          <w:szCs w:val="24"/>
-        </w:rPr>
-        <w:t>Usuario.idTipoUsuario</w:t>
-      </w:r>
-      <w:proofErr w:type="spellEnd"/>
-      <w:r>
-        <w:rPr>
-          <w:sz w:val="24"/>
-          <w:szCs w:val="24"/>
-        </w:rPr>
-        <w:t>=</w:t>
-      </w:r>
-      <w:proofErr w:type="spellStart"/>
-      <w:proofErr w:type="gramStart"/>
-      <w:r>
-        <w:rPr>
-          <w:sz w:val="24"/>
-          <w:szCs w:val="24"/>
-        </w:rPr>
-        <w:t>tipousuario.idTipoUsuario</w:t>
-      </w:r>
-      <w:proofErr w:type="spellEnd"/>
-      <w:proofErr w:type="gramEnd"/>
-      <w:r>
-        <w:rPr>
-          <w:sz w:val="24"/>
-          <w:szCs w:val="24"/>
-        </w:rPr>
-        <w:t>;</w:t>
+        <w:t>ON Usuario.idTipoUsuario=tipousuario.idTipoUsuario;</w:t>
       </w:r>
     </w:p>
     <w:p>
@@ -9835,71 +9537,23 @@
           <w:sz w:val="24"/>
           <w:szCs w:val="24"/>
         </w:rPr>
-        <w:t>FROM </w:t>
-      </w:r>
-      <w:proofErr w:type="spellStart"/>
-      <w:r>
+        <w:t>FROM DetalleVenta INNER JOIN Producto </w:t>
+      </w:r>
+    </w:p>
+    <w:p>
+      <w:pPr>
+        <w:ind w:left="720"/>
         <w:rPr>
           <w:sz w:val="24"/>
           <w:szCs w:val="24"/>
         </w:rPr>
-        <w:t>DetalleVenta</w:t>
-      </w:r>
-      <w:proofErr w:type="spellEnd"/>
+      </w:pPr>
       <w:r>
         <w:rPr>
           <w:sz w:val="24"/>
           <w:szCs w:val="24"/>
         </w:rPr>
-        <w:t> INNER JOIN Producto </w:t>
-      </w:r>
-    </w:p>
-    <w:p>
-      <w:pPr>
-        <w:ind w:left="720"/>
-        <w:rPr>
-          <w:sz w:val="24"/>
-          <w:szCs w:val="24"/>
-        </w:rPr>
-      </w:pPr>
-      <w:r>
-        <w:rPr>
-          <w:sz w:val="24"/>
-          <w:szCs w:val="24"/>
-        </w:rPr>
-        <w:t>ON </w:t>
-      </w:r>
-      <w:proofErr w:type="spellStart"/>
-      <w:r>
-        <w:rPr>
-          <w:sz w:val="24"/>
-          <w:szCs w:val="24"/>
-        </w:rPr>
-        <w:t>DetalleVenta.idProducto</w:t>
-      </w:r>
-      <w:proofErr w:type="spellEnd"/>
-      <w:r>
-        <w:rPr>
-          <w:sz w:val="24"/>
-          <w:szCs w:val="24"/>
-        </w:rPr>
-        <w:t>=</w:t>
-      </w:r>
-      <w:proofErr w:type="spellStart"/>
-      <w:r>
-        <w:rPr>
-          <w:sz w:val="24"/>
-          <w:szCs w:val="24"/>
-        </w:rPr>
-        <w:t>Producto.idProducto</w:t>
-      </w:r>
-      <w:proofErr w:type="spellEnd"/>
-      <w:r>
-        <w:rPr>
-          <w:sz w:val="24"/>
-          <w:szCs w:val="24"/>
-        </w:rPr>
-        <w:t>;</w:t>
+        <w:t>ON DetalleVenta.idProducto=Producto.idProducto;</w:t>
       </w:r>
     </w:p>
     <w:p>
@@ -10085,128 +9739,39 @@
           <w:sz w:val="24"/>
           <w:szCs w:val="24"/>
         </w:rPr>
-        <w:t xml:space="preserve">SELECT </w:t>
-      </w:r>
-      <w:proofErr w:type="spellStart"/>
-      <w:r>
+        <w:t>SELECT Venta.idVenta, MetodoPago.NombreMetodo, Venta.Total</w:t>
+      </w:r>
+    </w:p>
+    <w:p>
+      <w:pPr>
+        <w:ind w:left="720"/>
         <w:rPr>
           <w:sz w:val="24"/>
           <w:szCs w:val="24"/>
         </w:rPr>
-        <w:t>Venta.idVenta</w:t>
-      </w:r>
-      <w:proofErr w:type="spellEnd"/>
+      </w:pPr>
       <w:r>
         <w:rPr>
           <w:sz w:val="24"/>
           <w:szCs w:val="24"/>
         </w:rPr>
-        <w:t xml:space="preserve">, </w:t>
-      </w:r>
-      <w:proofErr w:type="spellStart"/>
-      <w:r>
+        <w:t xml:space="preserve">FROM Venta INNER JOIN MetodoPago </w:t>
+      </w:r>
+    </w:p>
+    <w:p>
+      <w:pPr>
+        <w:ind w:left="720"/>
         <w:rPr>
           <w:sz w:val="24"/>
           <w:szCs w:val="24"/>
         </w:rPr>
-        <w:t>MetodoPago.NombreMetodo</w:t>
-      </w:r>
-      <w:proofErr w:type="spellEnd"/>
+      </w:pPr>
       <w:r>
         <w:rPr>
           <w:sz w:val="24"/>
           <w:szCs w:val="24"/>
         </w:rPr>
-        <w:t xml:space="preserve">, </w:t>
-      </w:r>
-      <w:proofErr w:type="spellStart"/>
-      <w:r>
-        <w:rPr>
-          <w:sz w:val="24"/>
-          <w:szCs w:val="24"/>
-        </w:rPr>
-        <w:t>Venta.Total</w:t>
-      </w:r>
-      <w:proofErr w:type="spellEnd"/>
-    </w:p>
-    <w:p>
-      <w:pPr>
-        <w:ind w:left="720"/>
-        <w:rPr>
-          <w:sz w:val="24"/>
-          <w:szCs w:val="24"/>
-        </w:rPr>
-      </w:pPr>
-      <w:r>
-        <w:rPr>
-          <w:sz w:val="24"/>
-          <w:szCs w:val="24"/>
-        </w:rPr>
-        <w:t xml:space="preserve">FROM Venta INNER JOIN </w:t>
-      </w:r>
-      <w:proofErr w:type="spellStart"/>
-      <w:r>
-        <w:rPr>
-          <w:sz w:val="24"/>
-          <w:szCs w:val="24"/>
-        </w:rPr>
-        <w:t>MetodoPago</w:t>
-      </w:r>
-      <w:proofErr w:type="spellEnd"/>
-      <w:r>
-        <w:rPr>
-          <w:sz w:val="24"/>
-          <w:szCs w:val="24"/>
-        </w:rPr>
-        <w:t xml:space="preserve"> </w:t>
-      </w:r>
-    </w:p>
-    <w:p>
-      <w:pPr>
-        <w:ind w:left="720"/>
-        <w:rPr>
-          <w:sz w:val="24"/>
-          <w:szCs w:val="24"/>
-        </w:rPr>
-      </w:pPr>
-      <w:r>
-        <w:rPr>
-          <w:sz w:val="24"/>
-          <w:szCs w:val="24"/>
-        </w:rPr>
-        <w:t xml:space="preserve">ON </w:t>
-      </w:r>
-      <w:proofErr w:type="spellStart"/>
-      <w:r>
-        <w:rPr>
-          <w:sz w:val="24"/>
-          <w:szCs w:val="24"/>
-        </w:rPr>
-        <w:t>Venta.idMetodoPago</w:t>
-      </w:r>
-      <w:proofErr w:type="spellEnd"/>
-      <w:r>
-        <w:rPr>
-          <w:sz w:val="24"/>
-          <w:szCs w:val="24"/>
-        </w:rPr>
-        <w:t>=</w:t>
-      </w:r>
-      <w:proofErr w:type="spellStart"/>
-      <w:r>
-        <w:rPr>
-          <w:sz w:val="24"/>
-          <w:szCs w:val="24"/>
-        </w:rPr>
-        <w:t>MetodoPago.idMetodoPago</w:t>
-      </w:r>
-      <w:proofErr w:type="spellEnd"/>
-      <w:r>
-        <w:rPr>
-          <w:sz w:val="24"/>
-          <w:szCs w:val="24"/>
-        </w:rPr>
-        <w:t>;</w:t>
+        <w:t>ON Venta.idMetodoPago=MetodoPago.idMetodoPago;</w:t>
       </w:r>
     </w:p>
     <w:p>
@@ -10419,39 +9984,7 @@
           <w:sz w:val="24"/>
           <w:szCs w:val="24"/>
         </w:rPr>
-        <w:t>INNER JOIN Usuario ON </w:t>
-      </w:r>
-      <w:proofErr w:type="spellStart"/>
-      <w:r>
-        <w:rPr>
-          <w:sz w:val="24"/>
-          <w:szCs w:val="24"/>
-        </w:rPr>
-        <w:t>Venta.idUsuario</w:t>
-      </w:r>
-      <w:proofErr w:type="spellEnd"/>
-      <w:r>
-        <w:rPr>
-          <w:sz w:val="24"/>
-          <w:szCs w:val="24"/>
-        </w:rPr>
-        <w:t> = </w:t>
-      </w:r>
-      <w:proofErr w:type="spellStart"/>
-      <w:r>
-        <w:rPr>
-          <w:sz w:val="24"/>
-          <w:szCs w:val="24"/>
-        </w:rPr>
-        <w:t>Usuario.idUsuario</w:t>
-      </w:r>
-      <w:proofErr w:type="spellEnd"/>
-      <w:r>
-        <w:rPr>
-          <w:sz w:val="24"/>
-          <w:szCs w:val="24"/>
-        </w:rPr>
-        <w:t> </w:t>
+        <w:t>INNER JOIN Usuario ON Venta.idUsuario = Usuario.idUsuario </w:t>
       </w:r>
     </w:p>
     <w:p>
@@ -10472,23 +10005,7 @@
           <w:szCs w:val="24"/>
         </w:rPr>
         <w:lastRenderedPageBreak/>
-        <w:t>WHERE </w:t>
-      </w:r>
-      <w:proofErr w:type="spellStart"/>
-      <w:r>
-        <w:rPr>
-          <w:sz w:val="24"/>
-          <w:szCs w:val="24"/>
-        </w:rPr>
-        <w:t>Cliente.idCliente</w:t>
-      </w:r>
-      <w:proofErr w:type="spellEnd"/>
-      <w:r>
-        <w:rPr>
-          <w:sz w:val="24"/>
-          <w:szCs w:val="24"/>
-        </w:rPr>
-        <w:t> = 2;</w:t>
+        <w:t>WHERE Cliente.idCliente = 2;</w:t>
       </w:r>
     </w:p>
     <w:p>
@@ -10716,71 +10233,23 @@
           <w:sz w:val="24"/>
           <w:szCs w:val="24"/>
         </w:rPr>
-        <w:t>INNER JOIN Usuario ON </w:t>
-      </w:r>
-      <w:proofErr w:type="spellStart"/>
-      <w:r>
+        <w:t>INNER JOIN Usuario ON Venta.idUsuario = Usuario.idUsuario </w:t>
+      </w:r>
+    </w:p>
+    <w:p>
+      <w:pPr>
+        <w:ind w:left="720"/>
         <w:rPr>
           <w:sz w:val="24"/>
           <w:szCs w:val="24"/>
         </w:rPr>
-        <w:t>Venta.idUsuario</w:t>
-      </w:r>
-      <w:proofErr w:type="spellEnd"/>
+      </w:pPr>
       <w:r>
         <w:rPr>
           <w:sz w:val="24"/>
           <w:szCs w:val="24"/>
         </w:rPr>
-        <w:t> = </w:t>
-      </w:r>
-      <w:proofErr w:type="spellStart"/>
-      <w:r>
-        <w:rPr>
-          <w:sz w:val="24"/>
-          <w:szCs w:val="24"/>
-        </w:rPr>
-        <w:t>Usuario.idUsuario</w:t>
-      </w:r>
-      <w:proofErr w:type="spellEnd"/>
-      <w:r>
-        <w:rPr>
-          <w:sz w:val="24"/>
-          <w:szCs w:val="24"/>
-        </w:rPr>
-        <w:t> </w:t>
-      </w:r>
-    </w:p>
-    <w:p>
-      <w:pPr>
-        <w:ind w:left="720"/>
-        <w:rPr>
-          <w:sz w:val="24"/>
-          <w:szCs w:val="24"/>
-        </w:rPr>
-      </w:pPr>
-      <w:r>
-        <w:rPr>
-          <w:sz w:val="24"/>
-          <w:szCs w:val="24"/>
-        </w:rPr>
-        <w:t>WHERE </w:t>
-      </w:r>
-      <w:proofErr w:type="spellStart"/>
-      <w:r>
-        <w:rPr>
-          <w:sz w:val="24"/>
-          <w:szCs w:val="24"/>
-        </w:rPr>
-        <w:t>Cliente.idCliente</w:t>
-      </w:r>
-      <w:proofErr w:type="spellEnd"/>
-      <w:r>
-        <w:rPr>
-          <w:sz w:val="24"/>
-          <w:szCs w:val="24"/>
-        </w:rPr>
-        <w:t> = 2;</w:t>
+        <w:t>WHERE Cliente.idCliente = 2;</w:t>
       </w:r>
     </w:p>
     <w:p>
@@ -11130,7 +10599,6 @@
                 <w:lang w:val="en-US"/>
               </w:rPr>
             </w:pPr>
-            <w:proofErr w:type="spellStart"/>
             <w:r>
               <w:rPr>
                 <w:rFonts w:ascii="Calibri" w:eastAsia="Times New Roman" w:hAnsi="Calibri" w:cs="Calibri"/>
@@ -11139,31 +10607,8 @@
                 <w:color w:val="FFFFFF"/>
                 <w:lang w:val="en-US"/>
               </w:rPr>
-              <w:t>Escenario</w:t>
-            </w:r>
-            <w:proofErr w:type="spellEnd"/>
-            <w:r>
-              <w:rPr>
-                <w:rFonts w:ascii="Calibri" w:eastAsia="Times New Roman" w:hAnsi="Calibri" w:cs="Calibri"/>
-                <w:b/>
-                <w:bCs/>
-                <w:color w:val="FFFFFF"/>
-                <w:lang w:val="en-US"/>
-              </w:rPr>
-              <w:t xml:space="preserve"> / Caso de </w:t>
-            </w:r>
-            <w:proofErr w:type="spellStart"/>
-            <w:r>
-              <w:rPr>
-                <w:rFonts w:ascii="Calibri" w:eastAsia="Times New Roman" w:hAnsi="Calibri" w:cs="Calibri"/>
-                <w:b/>
-                <w:bCs/>
-                <w:color w:val="FFFFFF"/>
-                <w:lang w:val="en-US"/>
-              </w:rPr>
-              <w:t>Prueba</w:t>
-            </w:r>
-            <w:proofErr w:type="spellEnd"/>
+              <w:t>Escenario / Caso de Prueba</w:t>
+            </w:r>
           </w:p>
         </w:tc>
         <w:tc>
@@ -11191,7 +10636,6 @@
                 <w:lang w:val="en-US"/>
               </w:rPr>
             </w:pPr>
-            <w:proofErr w:type="spellStart"/>
             <w:r>
               <w:rPr>
                 <w:rFonts w:ascii="Calibri" w:eastAsia="Times New Roman" w:hAnsi="Calibri" w:cs="Calibri"/>
@@ -11200,40 +10644,7 @@
                 <w:color w:val="FFFFFF"/>
                 <w:lang w:val="en-US"/>
               </w:rPr>
-              <w:t>Resultado</w:t>
-            </w:r>
-            <w:proofErr w:type="spellEnd"/>
-            <w:r>
-              <w:rPr>
-                <w:rFonts w:ascii="Calibri" w:eastAsia="Times New Roman" w:hAnsi="Calibri" w:cs="Calibri"/>
-                <w:b/>
-                <w:bCs/>
-                <w:color w:val="FFFFFF"/>
-                <w:lang w:val="en-US"/>
-              </w:rPr>
-              <w:t xml:space="preserve"> </w:t>
-            </w:r>
-            <w:proofErr w:type="spellStart"/>
-            <w:r>
-              <w:rPr>
-                <w:rFonts w:ascii="Calibri" w:eastAsia="Times New Roman" w:hAnsi="Calibri" w:cs="Calibri"/>
-                <w:b/>
-                <w:bCs/>
-                <w:color w:val="FFFFFF"/>
-                <w:lang w:val="en-US"/>
-              </w:rPr>
-              <w:t>Esperado</w:t>
-            </w:r>
-            <w:proofErr w:type="spellEnd"/>
-            <w:r>
-              <w:rPr>
-                <w:rFonts w:ascii="Calibri" w:eastAsia="Times New Roman" w:hAnsi="Calibri" w:cs="Calibri"/>
-                <w:b/>
-                <w:bCs/>
-                <w:color w:val="FFFFFF"/>
-                <w:lang w:val="en-US"/>
-              </w:rPr>
-              <w:t xml:space="preserve"> (Salida)</w:t>
+              <w:t>Resultado Esperado (Salida)</w:t>
             </w:r>
           </w:p>
         </w:tc>
@@ -11305,25 +10716,7 @@
                 <w:color w:val="000000"/>
                 <w:lang w:val="es-MX"/>
               </w:rPr>
-              <w:t>Iniciar sesión con usuario '</w:t>
-            </w:r>
-            <w:proofErr w:type="spellStart"/>
-            <w:r>
-              <w:rPr>
-                <w:rFonts w:ascii="Calibri" w:eastAsia="Times New Roman" w:hAnsi="Calibri" w:cs="Calibri"/>
-                <w:color w:val="000000"/>
-                <w:lang w:val="es-MX"/>
-              </w:rPr>
-              <w:t>admin</w:t>
-            </w:r>
-            <w:proofErr w:type="spellEnd"/>
-            <w:r>
-              <w:rPr>
-                <w:rFonts w:ascii="Calibri" w:eastAsia="Times New Roman" w:hAnsi="Calibri" w:cs="Calibri"/>
-                <w:color w:val="000000"/>
-                <w:lang w:val="es-MX"/>
-              </w:rPr>
-              <w:t>' y contraseña correcta</w:t>
+              <w:t>Iniciar sesión con usuario 'admin' y contraseña correcta</w:t>
             </w:r>
           </w:p>
         </w:tc>
@@ -11426,25 +10819,7 @@
                 <w:color w:val="000000"/>
                 <w:lang w:val="es-MX"/>
               </w:rPr>
-              <w:t>Iniciar sesión con usuario '</w:t>
-            </w:r>
-            <w:proofErr w:type="spellStart"/>
-            <w:r>
-              <w:rPr>
-                <w:rFonts w:ascii="Calibri" w:eastAsia="Times New Roman" w:hAnsi="Calibri" w:cs="Calibri"/>
-                <w:color w:val="000000"/>
-                <w:lang w:val="es-MX"/>
-              </w:rPr>
-              <w:t>admin</w:t>
-            </w:r>
-            <w:proofErr w:type="spellEnd"/>
-            <w:r>
-              <w:rPr>
-                <w:rFonts w:ascii="Calibri" w:eastAsia="Times New Roman" w:hAnsi="Calibri" w:cs="Calibri"/>
-                <w:color w:val="000000"/>
-                <w:lang w:val="es-MX"/>
-              </w:rPr>
-              <w:t>' y contraseña incorrecta</w:t>
+              <w:t>Iniciar sesión con usuario 'admin' y contraseña incorrecta</w:t>
             </w:r>
           </w:p>
         </w:tc>
@@ -11884,34 +11259,14 @@
                 <w:lang w:val="en-US"/>
               </w:rPr>
             </w:pPr>
-            <w:proofErr w:type="spellStart"/>
             <w:r>
               <w:rPr>
                 <w:rFonts w:ascii="Calibri" w:eastAsia="Times New Roman" w:hAnsi="Calibri" w:cs="Calibri"/>
                 <w:color w:val="000000"/>
                 <w:lang w:val="en-US"/>
               </w:rPr>
-              <w:t>Transacción</w:t>
-            </w:r>
-            <w:proofErr w:type="spellEnd"/>
-            <w:r>
-              <w:rPr>
-                <w:rFonts w:ascii="Calibri" w:eastAsia="Times New Roman" w:hAnsi="Calibri" w:cs="Calibri"/>
-                <w:color w:val="000000"/>
-                <w:lang w:val="en-US"/>
-              </w:rPr>
-              <w:t xml:space="preserve"> </w:t>
-            </w:r>
-            <w:proofErr w:type="spellStart"/>
-            <w:r>
-              <w:rPr>
-                <w:rFonts w:ascii="Calibri" w:eastAsia="Times New Roman" w:hAnsi="Calibri" w:cs="Calibri"/>
-                <w:color w:val="000000"/>
-                <w:lang w:val="en-US"/>
-              </w:rPr>
-              <w:t>rechazada</w:t>
-            </w:r>
-            <w:proofErr w:type="spellEnd"/>
+              <w:t>Transacción rechazada</w:t>
+            </w:r>
           </w:p>
         </w:tc>
       </w:tr>
@@ -12009,59 +11364,13 @@
                 <w:lang w:val="en-US"/>
               </w:rPr>
             </w:pPr>
-            <w:proofErr w:type="spellStart"/>
             <w:r>
               <w:rPr>
                 <w:rFonts w:ascii="Calibri" w:eastAsia="Times New Roman" w:hAnsi="Calibri" w:cs="Calibri"/>
                 <w:color w:val="000000"/>
                 <w:lang w:val="en-US"/>
               </w:rPr>
-              <w:t>Mensaje</w:t>
-            </w:r>
-            <w:proofErr w:type="spellEnd"/>
-            <w:r>
-              <w:rPr>
-                <w:rFonts w:ascii="Calibri" w:eastAsia="Times New Roman" w:hAnsi="Calibri" w:cs="Calibri"/>
-                <w:color w:val="000000"/>
-                <w:lang w:val="en-US"/>
-              </w:rPr>
-              <w:t>: '</w:t>
-            </w:r>
-            <w:proofErr w:type="spellStart"/>
-            <w:r>
-              <w:rPr>
-                <w:rFonts w:ascii="Calibri" w:eastAsia="Times New Roman" w:hAnsi="Calibri" w:cs="Calibri"/>
-                <w:color w:val="000000"/>
-                <w:lang w:val="en-US"/>
-              </w:rPr>
-              <w:t>Producto</w:t>
-            </w:r>
-            <w:proofErr w:type="spellEnd"/>
-            <w:r>
-              <w:rPr>
-                <w:rFonts w:ascii="Calibri" w:eastAsia="Times New Roman" w:hAnsi="Calibri" w:cs="Calibri"/>
-                <w:color w:val="000000"/>
-                <w:lang w:val="en-US"/>
-              </w:rPr>
-              <w:t xml:space="preserve"> no </w:t>
-            </w:r>
-            <w:proofErr w:type="spellStart"/>
-            <w:r>
-              <w:rPr>
-                <w:rFonts w:ascii="Calibri" w:eastAsia="Times New Roman" w:hAnsi="Calibri" w:cs="Calibri"/>
-                <w:color w:val="000000"/>
-                <w:lang w:val="en-US"/>
-              </w:rPr>
-              <w:t>encontrado</w:t>
-            </w:r>
-            <w:proofErr w:type="spellEnd"/>
-            <w:r>
-              <w:rPr>
-                <w:rFonts w:ascii="Calibri" w:eastAsia="Times New Roman" w:hAnsi="Calibri" w:cs="Calibri"/>
-                <w:color w:val="000000"/>
-                <w:lang w:val="en-US"/>
-              </w:rPr>
-              <w:t>'</w:t>
+              <w:t>Mensaje: 'Producto no encontrado'</w:t>
             </w:r>
           </w:p>
         </w:tc>
@@ -12163,36 +11472,8 @@
                 <w:color w:val="000000"/>
                 <w:lang w:val="en-US"/>
               </w:rPr>
-              <w:t xml:space="preserve">Ticket </w:t>
-            </w:r>
-            <w:proofErr w:type="spellStart"/>
-            <w:r>
-              <w:rPr>
-                <w:rFonts w:ascii="Calibri" w:eastAsia="Times New Roman" w:hAnsi="Calibri" w:cs="Calibri"/>
-                <w:color w:val="000000"/>
-                <w:lang w:val="en-US"/>
-              </w:rPr>
-              <w:t>generado</w:t>
-            </w:r>
-            <w:proofErr w:type="spellEnd"/>
-            <w:r>
-              <w:rPr>
-                <w:rFonts w:ascii="Calibri" w:eastAsia="Times New Roman" w:hAnsi="Calibri" w:cs="Calibri"/>
-                <w:color w:val="000000"/>
-                <w:lang w:val="en-US"/>
-              </w:rPr>
-              <w:t xml:space="preserve"> y stock </w:t>
-            </w:r>
-            <w:proofErr w:type="spellStart"/>
-            <w:r>
-              <w:rPr>
-                <w:rFonts w:ascii="Calibri" w:eastAsia="Times New Roman" w:hAnsi="Calibri" w:cs="Calibri"/>
-                <w:color w:val="000000"/>
-                <w:lang w:val="en-US"/>
-              </w:rPr>
-              <w:t>actualizado</w:t>
-            </w:r>
-            <w:proofErr w:type="spellEnd"/>
+              <w:t>Ticket generado y stock actualizado</w:t>
+            </w:r>
           </w:p>
         </w:tc>
       </w:tr>
@@ -12290,34 +11571,14 @@
                 <w:lang w:val="en-US"/>
               </w:rPr>
             </w:pPr>
-            <w:proofErr w:type="spellStart"/>
             <w:r>
               <w:rPr>
                 <w:rFonts w:ascii="Calibri" w:eastAsia="Times New Roman" w:hAnsi="Calibri" w:cs="Calibri"/>
                 <w:color w:val="000000"/>
                 <w:lang w:val="en-US"/>
               </w:rPr>
-              <w:t>Confirmación</w:t>
-            </w:r>
-            <w:proofErr w:type="spellEnd"/>
-            <w:r>
-              <w:rPr>
-                <w:rFonts w:ascii="Calibri" w:eastAsia="Times New Roman" w:hAnsi="Calibri" w:cs="Calibri"/>
-                <w:color w:val="000000"/>
-                <w:lang w:val="en-US"/>
-              </w:rPr>
-              <w:t xml:space="preserve"> de baja </w:t>
-            </w:r>
-            <w:proofErr w:type="spellStart"/>
-            <w:r>
-              <w:rPr>
-                <w:rFonts w:ascii="Calibri" w:eastAsia="Times New Roman" w:hAnsi="Calibri" w:cs="Calibri"/>
-                <w:color w:val="000000"/>
-                <w:lang w:val="en-US"/>
-              </w:rPr>
-              <w:t>exitosa</w:t>
-            </w:r>
-            <w:proofErr w:type="spellEnd"/>
+              <w:t>Confirmación de baja exitosa</w:t>
+            </w:r>
           </w:p>
         </w:tc>
       </w:tr>
@@ -12522,7 +11783,6 @@
                 <w:lang w:val="en-US"/>
               </w:rPr>
             </w:pPr>
-            <w:proofErr w:type="spellStart"/>
             <w:r>
               <w:rPr>
                 <w:rFonts w:ascii="Calibri" w:eastAsia="Times New Roman" w:hAnsi="Calibri" w:cs="Calibri"/>
@@ -12533,7 +11793,6 @@
               </w:rPr>
               <w:t>Condiciones</w:t>
             </w:r>
-            <w:proofErr w:type="spellEnd"/>
           </w:p>
         </w:tc>
         <w:tc>
@@ -12888,36 +12147,8 @@
                 <w:color w:val="000000"/>
                 <w:lang w:val="en-US"/>
               </w:rPr>
-              <w:t xml:space="preserve">La </w:t>
-            </w:r>
-            <w:proofErr w:type="spellStart"/>
-            <w:r>
-              <w:rPr>
-                <w:rFonts w:ascii="Calibri" w:eastAsia="Times New Roman" w:hAnsi="Calibri" w:cs="Calibri"/>
-                <w:color w:val="000000"/>
-                <w:lang w:val="en-US"/>
-              </w:rPr>
-              <w:t>contraseña</w:t>
-            </w:r>
-            <w:proofErr w:type="spellEnd"/>
-            <w:r>
-              <w:rPr>
-                <w:rFonts w:ascii="Calibri" w:eastAsia="Times New Roman" w:hAnsi="Calibri" w:cs="Calibri"/>
-                <w:color w:val="000000"/>
-                <w:lang w:val="en-US"/>
-              </w:rPr>
-              <w:t xml:space="preserve"> es </w:t>
-            </w:r>
-            <w:proofErr w:type="spellStart"/>
-            <w:r>
-              <w:rPr>
-                <w:rFonts w:ascii="Calibri" w:eastAsia="Times New Roman" w:hAnsi="Calibri" w:cs="Calibri"/>
-                <w:color w:val="000000"/>
-                <w:lang w:val="en-US"/>
-              </w:rPr>
-              <w:t>correcta</w:t>
-            </w:r>
-            <w:proofErr w:type="spellEnd"/>
+              <w:t>La contraseña es correcta</w:t>
+            </w:r>
           </w:p>
         </w:tc>
         <w:tc>
@@ -13211,7 +12442,6 @@
                 <w:lang w:val="en-US"/>
               </w:rPr>
             </w:pPr>
-            <w:proofErr w:type="spellStart"/>
             <w:r>
               <w:rPr>
                 <w:rFonts w:ascii="Calibri" w:eastAsia="Times New Roman" w:hAnsi="Calibri" w:cs="Calibri"/>
@@ -13220,31 +12450,8 @@
                 <w:color w:val="FFFFFF"/>
                 <w:lang w:val="en-US"/>
               </w:rPr>
-              <w:t>Resultados</w:t>
-            </w:r>
-            <w:proofErr w:type="spellEnd"/>
-            <w:r>
-              <w:rPr>
-                <w:rFonts w:ascii="Calibri" w:eastAsia="Times New Roman" w:hAnsi="Calibri" w:cs="Calibri"/>
-                <w:b/>
-                <w:bCs/>
-                <w:color w:val="FFFFFF"/>
-                <w:lang w:val="en-US"/>
-              </w:rPr>
-              <w:t xml:space="preserve"> </w:t>
-            </w:r>
-            <w:proofErr w:type="spellStart"/>
-            <w:r>
-              <w:rPr>
-                <w:rFonts w:ascii="Calibri" w:eastAsia="Times New Roman" w:hAnsi="Calibri" w:cs="Calibri"/>
-                <w:b/>
-                <w:bCs/>
-                <w:color w:val="FFFFFF"/>
-                <w:lang w:val="en-US"/>
-              </w:rPr>
-              <w:t>Esperados</w:t>
-            </w:r>
-            <w:proofErr w:type="spellEnd"/>
+              <w:t>Resultados Esperados</w:t>
+            </w:r>
           </w:p>
         </w:tc>
         <w:tc>
@@ -13423,52 +12630,14 @@
                 <w:lang w:val="en-US"/>
               </w:rPr>
             </w:pPr>
-            <w:proofErr w:type="spellStart"/>
             <w:r>
               <w:rPr>
                 <w:rFonts w:ascii="Calibri" w:eastAsia="Times New Roman" w:hAnsi="Calibri" w:cs="Calibri"/>
                 <w:color w:val="000000"/>
                 <w:lang w:val="en-US"/>
               </w:rPr>
-              <w:t>Permitir</w:t>
-            </w:r>
-            <w:proofErr w:type="spellEnd"/>
-            <w:r>
-              <w:rPr>
-                <w:rFonts w:ascii="Calibri" w:eastAsia="Times New Roman" w:hAnsi="Calibri" w:cs="Calibri"/>
-                <w:color w:val="000000"/>
-                <w:lang w:val="en-US"/>
-              </w:rPr>
-              <w:t xml:space="preserve"> </w:t>
-            </w:r>
-            <w:proofErr w:type="spellStart"/>
-            <w:r>
-              <w:rPr>
-                <w:rFonts w:ascii="Calibri" w:eastAsia="Times New Roman" w:hAnsi="Calibri" w:cs="Calibri"/>
-                <w:color w:val="000000"/>
-                <w:lang w:val="en-US"/>
-              </w:rPr>
-              <w:t>acceso</w:t>
-            </w:r>
-            <w:proofErr w:type="spellEnd"/>
-            <w:r>
-              <w:rPr>
-                <w:rFonts w:ascii="Calibri" w:eastAsia="Times New Roman" w:hAnsi="Calibri" w:cs="Calibri"/>
-                <w:color w:val="000000"/>
-                <w:lang w:val="en-US"/>
-              </w:rPr>
-              <w:t xml:space="preserve"> al </w:t>
-            </w:r>
-            <w:proofErr w:type="spellStart"/>
-            <w:r>
-              <w:rPr>
-                <w:rFonts w:ascii="Calibri" w:eastAsia="Times New Roman" w:hAnsi="Calibri" w:cs="Calibri"/>
-                <w:color w:val="000000"/>
-                <w:lang w:val="en-US"/>
-              </w:rPr>
-              <w:t>sistema</w:t>
-            </w:r>
-            <w:proofErr w:type="spellEnd"/>
+              <w:t>Permitir acceso al sistema</w:t>
+            </w:r>
           </w:p>
         </w:tc>
         <w:tc>
@@ -13608,52 +12777,14 @@
                 <w:lang w:val="en-US"/>
               </w:rPr>
             </w:pPr>
-            <w:proofErr w:type="spellStart"/>
             <w:r>
               <w:rPr>
                 <w:rFonts w:ascii="Calibri" w:eastAsia="Times New Roman" w:hAnsi="Calibri" w:cs="Calibri"/>
                 <w:color w:val="000000"/>
                 <w:lang w:val="en-US"/>
               </w:rPr>
-              <w:t>Mostrar</w:t>
-            </w:r>
-            <w:proofErr w:type="spellEnd"/>
-            <w:r>
-              <w:rPr>
-                <w:rFonts w:ascii="Calibri" w:eastAsia="Times New Roman" w:hAnsi="Calibri" w:cs="Calibri"/>
-                <w:color w:val="000000"/>
-                <w:lang w:val="en-US"/>
-              </w:rPr>
-              <w:t xml:space="preserve"> error: </w:t>
-            </w:r>
-            <w:proofErr w:type="spellStart"/>
-            <w:r>
-              <w:rPr>
-                <w:rFonts w:ascii="Calibri" w:eastAsia="Times New Roman" w:hAnsi="Calibri" w:cs="Calibri"/>
-                <w:color w:val="000000"/>
-                <w:lang w:val="en-US"/>
-              </w:rPr>
-              <w:t>Credenciales</w:t>
-            </w:r>
-            <w:proofErr w:type="spellEnd"/>
-            <w:r>
-              <w:rPr>
-                <w:rFonts w:ascii="Calibri" w:eastAsia="Times New Roman" w:hAnsi="Calibri" w:cs="Calibri"/>
-                <w:color w:val="000000"/>
-                <w:lang w:val="en-US"/>
-              </w:rPr>
-              <w:t xml:space="preserve"> </w:t>
-            </w:r>
-            <w:proofErr w:type="spellStart"/>
-            <w:r>
-              <w:rPr>
-                <w:rFonts w:ascii="Calibri" w:eastAsia="Times New Roman" w:hAnsi="Calibri" w:cs="Calibri"/>
-                <w:color w:val="000000"/>
-                <w:lang w:val="en-US"/>
-              </w:rPr>
-              <w:t>inválidas</w:t>
-            </w:r>
-            <w:proofErr w:type="spellEnd"/>
+              <w:t>Mostrar error: Credenciales inválidas</w:t>
+            </w:r>
           </w:p>
         </w:tc>
         <w:tc>
@@ -13975,7 +13106,6 @@
                 <w:lang w:val="en-US"/>
               </w:rPr>
             </w:pPr>
-            <w:proofErr w:type="spellStart"/>
             <w:r>
               <w:rPr>
                 <w:rFonts w:ascii="Calibri" w:eastAsia="Times New Roman" w:hAnsi="Calibri" w:cs="Calibri"/>
@@ -13986,7 +13116,6 @@
               </w:rPr>
               <w:t>Condiciones</w:t>
             </w:r>
-            <w:proofErr w:type="spellEnd"/>
           </w:p>
         </w:tc>
         <w:tc>
@@ -14631,7 +13760,6 @@
                 <w:lang w:val="en-US"/>
               </w:rPr>
             </w:pPr>
-            <w:proofErr w:type="spellStart"/>
             <w:r>
               <w:rPr>
                 <w:rFonts w:ascii="Calibri" w:eastAsia="Times New Roman" w:hAnsi="Calibri" w:cs="Calibri"/>
@@ -14640,31 +13768,8 @@
                 <w:color w:val="FFFFFF"/>
                 <w:lang w:val="en-US"/>
               </w:rPr>
-              <w:t>Resultados</w:t>
-            </w:r>
-            <w:proofErr w:type="spellEnd"/>
-            <w:r>
-              <w:rPr>
-                <w:rFonts w:ascii="Calibri" w:eastAsia="Times New Roman" w:hAnsi="Calibri" w:cs="Calibri"/>
-                <w:b/>
-                <w:bCs/>
-                <w:color w:val="FFFFFF"/>
-                <w:lang w:val="en-US"/>
-              </w:rPr>
-              <w:t xml:space="preserve"> </w:t>
-            </w:r>
-            <w:proofErr w:type="spellStart"/>
-            <w:r>
-              <w:rPr>
-                <w:rFonts w:ascii="Calibri" w:eastAsia="Times New Roman" w:hAnsi="Calibri" w:cs="Calibri"/>
-                <w:b/>
-                <w:bCs/>
-                <w:color w:val="FFFFFF"/>
-                <w:lang w:val="en-US"/>
-              </w:rPr>
-              <w:t>Esperados</w:t>
-            </w:r>
-            <w:proofErr w:type="spellEnd"/>
+              <w:t>Resultados Esperados</w:t>
+            </w:r>
           </w:p>
         </w:tc>
         <w:tc>
@@ -14849,25 +13954,7 @@
                 <w:color w:val="000000"/>
                 <w:lang w:val="es-MX"/>
               </w:rPr>
-              <w:t xml:space="preserve">Generar </w:t>
-            </w:r>
-            <w:proofErr w:type="gramStart"/>
-            <w:r>
-              <w:rPr>
-                <w:rFonts w:ascii="Calibri" w:eastAsia="Times New Roman" w:hAnsi="Calibri" w:cs="Calibri"/>
-                <w:color w:val="000000"/>
-                <w:lang w:val="es-MX"/>
-              </w:rPr>
-              <w:t>ticket</w:t>
-            </w:r>
-            <w:proofErr w:type="gramEnd"/>
-            <w:r>
-              <w:rPr>
-                <w:rFonts w:ascii="Calibri" w:eastAsia="Times New Roman" w:hAnsi="Calibri" w:cs="Calibri"/>
-                <w:color w:val="000000"/>
-                <w:lang w:val="es-MX"/>
-              </w:rPr>
-              <w:t xml:space="preserve"> y registrar venta</w:t>
+              <w:t>Generar ticket y registrar venta</w:t>
             </w:r>
           </w:p>
         </w:tc>
@@ -15180,27 +14267,7 @@
           <w:szCs w:val="24"/>
           <w:lang w:val="es-MX"/>
         </w:rPr>
-        <w:t xml:space="preserve">El sistema POS tendrá como funcionalidades principales el registro de ventas, gestión de productos, generación de </w:t>
-      </w:r>
-      <w:proofErr w:type="gramStart"/>
-      <w:r>
-        <w:rPr>
-          <w:rFonts w:ascii="Proxima Nova" w:hAnsi="Proxima Nova"/>
-          <w:sz w:val="24"/>
-          <w:szCs w:val="24"/>
-          <w:lang w:val="es-MX"/>
-        </w:rPr>
-        <w:t>tickets</w:t>
-      </w:r>
-      <w:proofErr w:type="gramEnd"/>
-      <w:r>
-        <w:rPr>
-          <w:rFonts w:ascii="Proxima Nova" w:hAnsi="Proxima Nova"/>
-          <w:sz w:val="24"/>
-          <w:szCs w:val="24"/>
-          <w:lang w:val="es-MX"/>
-        </w:rPr>
-        <w:t>, control de inventario, consulta de reportes y autenticación de usuarios. Los usuarios del sistema son el cajero, que registra ventas; el administrador, que gestiona productos y reportes; el cliente, que recibe el comprobante; y la base de datos, que almacena la información.</w:t>
+        <w:t>El sistema POS tendrá como funcionalidades principales el registro de ventas, gestión de productos, generación de tickets, control de inventario, consulta de reportes y autenticación de usuarios. Los usuarios del sistema son el cajero, que registra ventas; el administrador, que gestiona productos y reportes; el cliente, que recibe el comprobante; y la base de datos, que almacena la información.</w:t>
       </w:r>
     </w:p>
     <w:p>
@@ -15335,21 +14402,7 @@
         <w:rPr>
           <w:lang w:val="es-MX"/>
         </w:rPr>
-        <w:t xml:space="preserve">Pearson College </w:t>
-      </w:r>
-      <w:proofErr w:type="spellStart"/>
-      <w:r>
-        <w:rPr>
-          <w:lang w:val="es-MX"/>
-        </w:rPr>
-        <w:t>Division</w:t>
-      </w:r>
-      <w:proofErr w:type="spellEnd"/>
-      <w:r>
-        <w:rPr>
-          <w:lang w:val="es-MX"/>
-        </w:rPr>
-        <w:t>, 2012.</w:t>
+        <w:t>Pearson College Division, 2012.</w:t>
       </w:r>
     </w:p>
     <w:p>
@@ -15438,36 +14491,8 @@
           <w:iCs/>
           <w:lang w:val="es-MX"/>
         </w:rPr>
-        <w:t xml:space="preserve">Java: How </w:t>
-      </w:r>
-      <w:proofErr w:type="spellStart"/>
-      <w:r>
-        <w:rPr>
-          <w:i/>
-          <w:iCs/>
-          <w:lang w:val="es-MX"/>
-        </w:rPr>
-        <w:t>to</w:t>
-      </w:r>
-      <w:proofErr w:type="spellEnd"/>
-      <w:r>
-        <w:rPr>
-          <w:i/>
-          <w:iCs/>
-          <w:lang w:val="es-MX"/>
-        </w:rPr>
-        <w:t xml:space="preserve"> </w:t>
-      </w:r>
-      <w:proofErr w:type="spellStart"/>
-      <w:r>
-        <w:rPr>
-          <w:i/>
-          <w:iCs/>
-          <w:lang w:val="es-MX"/>
-        </w:rPr>
-        <w:t>Program</w:t>
-      </w:r>
-      <w:proofErr w:type="spellEnd"/>
+        <w:t>Java: How to Program</w:t>
+      </w:r>
       <w:r>
         <w:rPr>
           <w:lang w:val="es-MX"/>
@@ -15478,21 +14503,7 @@
         <w:rPr>
           <w:lang w:val="es-MX"/>
         </w:rPr>
-        <w:t xml:space="preserve">Pearson College </w:t>
-      </w:r>
-      <w:proofErr w:type="spellStart"/>
-      <w:r>
-        <w:rPr>
-          <w:lang w:val="es-MX"/>
-        </w:rPr>
-        <w:t>Division</w:t>
-      </w:r>
-      <w:proofErr w:type="spellEnd"/>
-      <w:r>
-        <w:rPr>
-          <w:lang w:val="es-MX"/>
-        </w:rPr>
-        <w:t>, 2012.</w:t>
+        <w:t>Pearson College Division, 2012.</w:t>
       </w:r>
     </w:p>
     <w:p>
@@ -15511,21 +14522,7 @@
         <w:rPr>
           <w:lang w:val="es-MX"/>
         </w:rPr>
-        <w:t xml:space="preserve">J. M. Alarcón, “TUTORIAL SQL #3: Consultas SELECT </w:t>
-      </w:r>
-      <w:proofErr w:type="spellStart"/>
-      <w:r>
-        <w:rPr>
-          <w:lang w:val="es-MX"/>
-        </w:rPr>
-        <w:t>multi-tabla</w:t>
-      </w:r>
-      <w:proofErr w:type="spellEnd"/>
-      <w:r>
-        <w:rPr>
-          <w:lang w:val="es-MX"/>
-        </w:rPr>
-        <w:t xml:space="preserve"> básicas - JOIN - campusMVP.es,” </w:t>
+        <w:t>J. M. Alarcón, “TUTORIAL SQL #3: Consultas SELECT multi-tabla básicas - JOIN - campusMVP.es,” </w:t>
       </w:r>
       <w:r>
         <w:rPr>
@@ -15539,21 +14536,7 @@
         <w:rPr>
           <w:lang w:val="es-MX"/>
         </w:rPr>
-        <w:t xml:space="preserve">, </w:t>
-      </w:r>
-      <w:proofErr w:type="gramStart"/>
-      <w:r>
-        <w:rPr>
-          <w:lang w:val="es-MX"/>
-        </w:rPr>
-        <w:t>Nov.</w:t>
-      </w:r>
-      <w:proofErr w:type="gramEnd"/>
-      <w:r>
-        <w:rPr>
-          <w:lang w:val="es-MX"/>
-        </w:rPr>
-        <w:t xml:space="preserve"> 08, 2021. https://www.campusmvp.es/recursos/post/Fundamentos-de-SQL-Consultas-SELECT-multi-tabla-JOIN.aspx?srsltid=AfmBOopskdiflcUrK1YPlKBgu3YU_Pp8I4vbFXceZg4CPHaEj1YiFixS</w:t>
+        <w:t>, Nov. 08, 2021. https://www.campusmvp.es/recursos/post/Fundamentos-de-SQL-Consultas-SELECT-multi-tabla-JOIN.aspx?srsltid=AfmBOopskdiflcUrK1YPlKBgu3YU_Pp8I4vbFXceZg4CPHaEj1YiFixS</w:t>
       </w:r>
     </w:p>
     <w:sectPr>
@@ -21386,6 +20369,10 @@
 </file>
 
 <file path=customXml/item1.xml><?xml version="1.0" encoding="utf-8"?>
+<b:Sources xmlns:b="http://schemas.openxmlformats.org/officeDocument/2006/bibliography" xmlns="http://schemas.openxmlformats.org/officeDocument/2006/bibliography" SelectedStyle="\APASixthEditionOfficeOnline.xsl" StyleName="APA" Version="6"/>
+</file>
+
+<file path=customXml/item2.xml><?xml version="1.0" encoding="utf-8"?>
 <ct:contentTypeSchema xmlns:ct="http://schemas.microsoft.com/office/2006/metadata/contentType" xmlns:ma="http://schemas.microsoft.com/office/2006/metadata/properties/metaAttributes" ct:_="" ma:_="" ma:contentTypeName="Documento" ma:contentTypeID="0x0101000B2DA986428C6D4197D4689B953C8258" ma:contentTypeVersion="15" ma:contentTypeDescription="Crear nuevo documento." ma:contentTypeScope="" ma:versionID="ee2c4a27c82992793e68ca7a2d46f515">
   <xsd:schema xmlns:xsd="http://www.w3.org/2001/XMLSchema" xmlns:xs="http://www.w3.org/2001/XMLSchema" xmlns:p="http://schemas.microsoft.com/office/2006/metadata/properties" xmlns:ns3="c388e7ed-69ad-4d35-a3aa-b40fe6d7385e" targetNamespace="http://schemas.microsoft.com/office/2006/metadata/properties" ma:root="true" ma:fieldsID="fd52fa61c07550eaadb57e27d5f42fe6" ns3:_="">
     <xsd:import namespace="c388e7ed-69ad-4d35-a3aa-b40fe6d7385e"/>
@@ -21599,19 +20586,7 @@
 </ct:contentTypeSchema>
 </file>
 
-<file path=customXml/item2.xml><?xml version="1.0" encoding="utf-8"?>
-<b:Sources xmlns:b="http://schemas.openxmlformats.org/officeDocument/2006/bibliography" xmlns="http://schemas.openxmlformats.org/officeDocument/2006/bibliography" SelectedStyle="\APASixthEditionOfficeOnline.xsl" StyleName="APA" Version="6"/>
-</file>
-
 <file path=customXml/item3.xml><?xml version="1.0" encoding="utf-8"?>
-<p:properties xmlns:p="http://schemas.microsoft.com/office/2006/metadata/properties" xmlns:xsi="http://www.w3.org/2001/XMLSchema-instance" xmlns:pc="http://schemas.microsoft.com/office/infopath/2007/PartnerControls">
-  <documentManagement>
-    <_activity xmlns="c388e7ed-69ad-4d35-a3aa-b40fe6d7385e" xsi:nil="true"/>
-  </documentManagement>
-</p:properties>
-</file>
-
-<file path=customXml/item4.xml><?xml version="1.0" encoding="utf-8"?>
 <?mso-contentType ?>
 <FormTemplates xmlns="http://schemas.microsoft.com/sharepoint/v3/contenttype/forms">
   <Display>DocumentLibraryForm</Display>
@@ -21620,7 +20595,23 @@
 </FormTemplates>
 </file>
 
+<file path=customXml/item4.xml><?xml version="1.0" encoding="utf-8"?>
+<p:properties xmlns:p="http://schemas.microsoft.com/office/2006/metadata/properties" xmlns:xsi="http://www.w3.org/2001/XMLSchema-instance" xmlns:pc="http://schemas.microsoft.com/office/infopath/2007/PartnerControls">
+  <documentManagement>
+    <_activity xmlns="c388e7ed-69ad-4d35-a3aa-b40fe6d7385e" xsi:nil="true"/>
+  </documentManagement>
+</p:properties>
+</file>
+
 <file path=customXml/itemProps1.xml><?xml version="1.0" encoding="utf-8"?>
+<ds:datastoreItem xmlns:ds="http://schemas.openxmlformats.org/officeDocument/2006/customXml" ds:itemID="{B3BC736D-5B64-4050-8937-6A59A58A74B1}">
+  <ds:schemaRefs>
+    <ds:schemaRef ds:uri="http://schemas.openxmlformats.org/officeDocument/2006/bibliography"/>
+  </ds:schemaRefs>
+</ds:datastoreItem>
+</file>
+
+<file path=customXml/itemProps2.xml><?xml version="1.0" encoding="utf-8"?>
 <ds:datastoreItem xmlns:ds="http://schemas.openxmlformats.org/officeDocument/2006/customXml" ds:itemID="{329A9CB0-8652-4CE1-B6BF-9E7381E3A7F1}">
   <ds:schemaRefs>
     <ds:schemaRef ds:uri="http://schemas.microsoft.com/office/2006/metadata/contentType"/>
@@ -21638,15 +20629,15 @@
 </ds:datastoreItem>
 </file>
 
-<file path=customXml/itemProps2.xml><?xml version="1.0" encoding="utf-8"?>
-<ds:datastoreItem xmlns:ds="http://schemas.openxmlformats.org/officeDocument/2006/customXml" ds:itemID="{B3BC736D-5B64-4050-8937-6A59A58A74B1}">
+<file path=customXml/itemProps3.xml><?xml version="1.0" encoding="utf-8"?>
+<ds:datastoreItem xmlns:ds="http://schemas.openxmlformats.org/officeDocument/2006/customXml" ds:itemID="{D71B902D-3435-47C9-9E65-A3EA1C41A691}">
   <ds:schemaRefs>
-    <ds:schemaRef ds:uri="http://schemas.openxmlformats.org/officeDocument/2006/bibliography"/>
+    <ds:schemaRef ds:uri="http://schemas.microsoft.com/sharepoint/v3/contenttype/forms"/>
   </ds:schemaRefs>
 </ds:datastoreItem>
 </file>
 
-<file path=customXml/itemProps3.xml><?xml version="1.0" encoding="utf-8"?>
+<file path=customXml/itemProps4.xml><?xml version="1.0" encoding="utf-8"?>
 <ds:datastoreItem xmlns:ds="http://schemas.openxmlformats.org/officeDocument/2006/customXml" ds:itemID="{34249462-321E-43E3-96B4-5C92BE09AF89}">
   <ds:schemaRefs>
     <ds:schemaRef ds:uri="http://schemas.microsoft.com/office/2006/metadata/properties"/>
@@ -21654,12 +20645,4 @@
     <ds:schemaRef ds:uri="c388e7ed-69ad-4d35-a3aa-b40fe6d7385e"/>
   </ds:schemaRefs>
 </ds:datastoreItem>
-</file>
-
-<file path=customXml/itemProps4.xml><?xml version="1.0" encoding="utf-8"?>
-<ds:datastoreItem xmlns:ds="http://schemas.openxmlformats.org/officeDocument/2006/customXml" ds:itemID="{D71B902D-3435-47C9-9E65-A3EA1C41A691}">
-  <ds:schemaRefs>
-    <ds:schemaRef ds:uri="http://schemas.microsoft.com/sharepoint/v3/contenttype/forms"/>
-  </ds:schemaRefs>
-</ds:datastoreItem>
 </file>
</xml_diff>